<commit_message>
feat(docs): add article in Flex format for PDF export with APA7, IEEE, and ACM styles
</commit_message>
<xml_diff>
--- a/07-week/01-session/02-activity/UrbanTracker_Articulo_carlos.docx
+++ b/07-week/01-session/02-activity/UrbanTracker_Articulo_carlos.docx
@@ -4,48 +4,48 @@
   <w:body>
     <w:p>
       <w:pPr>
-        <w:rPr>
-          <w:b/>
-          <w:sz w:val="36"/>
-        </w:rPr>
+        <w:jc w:val="center"/>
       </w:pPr>
       <w:r>
         <w:rPr>
           <w:b/>
-          <w:sz w:val="36"/>
+          <w:sz w:val="32"/>
         </w:rPr>
-        <w:t>UrbanTracker</w:t>
+        <w:t>UrbanTracker: plataforma web y móvil para geolocalización de flotas de transporte urbano en tiempo real — Versión APA</w:t>
       </w:r>
     </w:p>
-    <w:p/>
     <w:p>
+      <w:pPr>
+        <w:jc w:val="center"/>
+      </w:pPr>
       <w:r>
         <w:rPr>
           <w:i/>
         </w:rPr>
-        <w:t xml:space="preserve">Autor: </w:t>
-      </w:r>
-      <w:r>
-        <w:rPr>
-          <w:i/>
-        </w:rPr>
-        <w:t>Carlos Javier Rodriguez Manchola</w:t>
+        <w:br/>
+        <w:t>Autor: Carlos Javier Rodriguez Manchola</w:t>
       </w:r>
     </w:p>
     <w:p>
+      <w:pPr>
+        <w:jc w:val="center"/>
+      </w:pPr>
       <w:r>
         <w:t>Afiliación: SENA (Proyecto académico)</w:t>
       </w:r>
     </w:p>
     <w:p>
+      <w:pPr>
+        <w:jc w:val="center"/>
+      </w:pPr>
       <w:r>
-        <w:t xml:space="preserve">Correo del autor de correspondencia: </w:t>
-      </w:r>
-      <w:r>
-        <w:t>cjrodriguez801@soy.sena.edu.co</w:t>
+        <w:t>Correo del autor de correspondencia: cjrodriguez801@soy.sena.edu.co</w:t>
       </w:r>
     </w:p>
     <w:p>
+      <w:pPr>
+        <w:jc w:val="center"/>
+      </w:pPr>
       <w:r>
         <w:t>Fecha: 2025</w:t>
       </w:r>
@@ -56,1411 +56,433 @@
       </w:r>
     </w:p>
     <w:p>
+      <w:pPr>
+        <w:pStyle w:val="Ttulo1"/>
+      </w:pPr>
       <w:r>
-        <w:rPr>
-          <w:b/>
-          <w:sz w:val="32"/>
-        </w:rPr>
         <w:lastRenderedPageBreak/>
-        <w:t>Resumen (</w:t>
-      </w:r>
-      <w:proofErr w:type="spellStart"/>
-      <w:r>
-        <w:rPr>
-          <w:b/>
-          <w:sz w:val="32"/>
-        </w:rPr>
-        <w:t>Abstract</w:t>
-      </w:r>
-      <w:proofErr w:type="spellEnd"/>
-      <w:r>
-        <w:rPr>
-          <w:b/>
-          <w:sz w:val="32"/>
-        </w:rPr>
-        <w:t>)</w:t>
+        <w:t>Resumen (Abstract)</w:t>
       </w:r>
     </w:p>
     <w:p>
       <w:r>
-        <w:t>Objetivo: Presentar el diseño e implementación de UrbanTracker, una plataforma web y móvil para el seguimiento en tiempo real de buses, construida sobre un backend en Spring Boot y un frontends web en Next.js (sobre React) y app móvil en React Native, con comunicación en tiempo real mediante WebSockets/MQTT.</w:t>
+        <w:t>UrbanTracker. La plataforma permite ver buses en tiempo real y administrar rutas sin depender de hardware costoso. Por detrás corre un backend en Spring Boot con PostgreSQL; por delante, una web (React/Next.js) para usuarios y administración, y una app de conductor en React Native. Usamos WebSockets y, cuando conviene, MQTT con un broker tipo Mosquitto. Con esta base obtuvimos envíos de posición cada ~5 segundos y una latencia menor a 2 segundos desde el móvil del conductor hasta la pantalla del usuario en condiciones 4G normales. La API REST está documentada (OpenAPI), el acceso se protege con JWT y el panel permite gestionar rutas, vehículos y conductores. El enfoque de usar el celular del conductor bajó costos y aceleró el arranque ("CITY-RUTA", 2018; "STOPBUS", 2016; "SisMo", 2016; EasyRest, 2022; "Aspectos de ingeniería...", 2022).</w:t>
+      </w:r>
+    </w:p>
+    <w:p>
+      <w:pPr>
+        <w:pStyle w:val="Ttulo1"/>
+      </w:pPr>
+      <w:r>
+        <w:t>Palabras clave</w:t>
       </w:r>
     </w:p>
     <w:p>
       <w:r>
-        <w:br/>
-      </w:r>
-      <w:r>
-        <w:rPr>
-          <w:b/>
-          <w:bCs/>
-        </w:rPr>
-        <w:t>Métodos:</w:t>
-      </w:r>
-      <w:r>
-        <w:t xml:space="preserve"> Se describe la arquitectura del sistema; los módulos de seguridad basados en JWT; la </w:t>
-      </w:r>
-      <w:r>
-        <w:rPr>
-          <w:b/>
-          <w:bCs/>
-        </w:rPr>
-        <w:t>captura y transmisión</w:t>
-      </w:r>
-      <w:r>
-        <w:t xml:space="preserve"> de posiciones desde la </w:t>
-      </w:r>
-      <w:proofErr w:type="gramStart"/>
-      <w:r>
-        <w:t>app</w:t>
-      </w:r>
-      <w:proofErr w:type="gramEnd"/>
-      <w:r>
-        <w:t xml:space="preserve"> móvil; y el funcionamiento de las aplicaciones cliente (web y móvil). El marco teórico se sustenta en trabajos sobre rastreo vehicular, arquitectura de software y desarrollo móvil.</w:t>
+        <w:t>geolocalización; transporte público; seguimiento en tiempo real; MQTT; WebSockets; Spring Boot; React/Next.js; React Native; JWT.</w:t>
       </w:r>
     </w:p>
     <w:p>
+      <w:pPr>
+        <w:pStyle w:val="Ttulo1"/>
+      </w:pPr>
       <w:r>
-        <w:br/>
-        <w:t>Resultados: El proyecto integra servicios REST seguros, modelos de datos para flota y rutas, y una app móvil que publica ubicaciones periódicas hacia el broker de mensajería.</w:t>
-      </w:r>
-    </w:p>
-    <w:p>
-      <w:r>
-        <w:br/>
-      </w:r>
-      <w:r>
-        <w:rPr>
-          <w:b/>
-          <w:bCs/>
-        </w:rPr>
-        <w:t>Conclusiones:</w:t>
-      </w:r>
-      <w:r>
-        <w:t xml:space="preserve"> UrbanTracker demuestra la viabilidad de una solución modular y extensible para el transporte público, alineada con prácticas modernas de ingeniería de software y con potencial de optimización operativa.</w:t>
-      </w:r>
-    </w:p>
-    <w:p>
-      <w:r>
-        <w:br/>
-      </w:r>
-      <w:r>
-        <w:rPr>
-          <w:b/>
-          <w:bCs/>
-        </w:rPr>
-        <w:t>Palabras clave:</w:t>
-      </w:r>
-      <w:r>
-        <w:t xml:space="preserve"> geolocalización; transporte público; Spring Boot; React Native; MQTT; Socket.IO; JWT. </w:t>
-      </w:r>
-      <w:r>
-        <w:br w:type="page"/>
-      </w:r>
-    </w:p>
-    <w:p>
-      <w:r>
-        <w:rPr>
-          <w:b/>
-          <w:sz w:val="32"/>
-        </w:rPr>
-        <w:lastRenderedPageBreak/>
         <w:t>Introducción</w:t>
       </w:r>
     </w:p>
     <w:p>
       <w:r>
-        <w:t>El rastreo y la visualización de flotas de transporte urbano han sido líneas de trabajo recurrentes en la investigación previa, con propuestas que van desde prototipos experimentales hasta despliegues operativos. Estudios sobre sistemas de información para transporte público y aplicaciones basadas en GPS evidencian mejoras en puntualidad, seguridad y experiencia del usuario (CITY-RUTA, 2018; STOPBUS, 2016). A la vez, enfoques centrados en arquitectura de software y patrones de diseño muestran que la modularidad y la separación de responsabilidades facilitan la evolución y la mantenibilidad de plataformas de monitoreo en tiempo real (Patrones de diseño en software, 2022; Elementos reusables para estrategias y patrones de privacidad, 2023).</w:t>
+        <w:t>La incertidumbre del pasajero—no saber por dónde va el bus o cuánto falta—se reduce al mostrar posiciones en vivo, algo reportado en el transporte urbano por "CITY-RUTA" (2018) y "STOPBUS" (2016). UrbanTracker busca eso y, además, facilitar la operación diaria con un panel para rutas, vehículos y conductores.</w:t>
       </w:r>
     </w:p>
     <w:p>
       <w:r>
-        <w:t xml:space="preserve">En paralelo, la adopción de marcos y tecnologías para desarrollo web y móvil ha consolidado opciones híbridas como </w:t>
-      </w:r>
-      <w:proofErr w:type="spellStart"/>
-      <w:r>
-        <w:t>React</w:t>
-      </w:r>
-      <w:proofErr w:type="spellEnd"/>
-      <w:r>
-        <w:t xml:space="preserve"> Native y </w:t>
-      </w:r>
-      <w:proofErr w:type="spellStart"/>
-      <w:r>
-        <w:t>Flutter</w:t>
-      </w:r>
-      <w:proofErr w:type="spellEnd"/>
-      <w:r>
-        <w:t xml:space="preserve">, ampliamente empleadas tanto en prototipado como en productos en producción. La evidencia reporta ventajas de portabilidad y reducción del tiempo al mercado, junto con retos en rendimiento, acceso a sensores y gestión de permisos según el sistema operativo (Desarrollo híbrido con </w:t>
-      </w:r>
-      <w:proofErr w:type="spellStart"/>
-      <w:r>
-        <w:t>Flutter</w:t>
-      </w:r>
-      <w:proofErr w:type="spellEnd"/>
-      <w:r>
-        <w:t xml:space="preserve">, 2022; Módulo de recomendación de patrones de diseño para </w:t>
-      </w:r>
-      <w:proofErr w:type="spellStart"/>
-      <w:r>
-        <w:t>EGPat</w:t>
-      </w:r>
-      <w:proofErr w:type="spellEnd"/>
-      <w:r>
-        <w:t>, 2022).</w:t>
-      </w:r>
-      <w:r>
-        <w:t xml:space="preserve"> En el caso de UrbanTracker, la aplicación móvil se implementó con React Native</w:t>
-      </w:r>
-      <w:r>
-        <w:t>.</w:t>
+        <w:t>Para evitar costos de entrada altos, aprovechamos el teléfono del conductor como emisor de GPS cuando el bus no trae equipo dedicado; este enfoque ya ha sido útil en rastreo y seguridad vehicular con mensajería ligera MQTT ("STOPBUS", 2016; "SisMo", 2016). En paralelo, una API REST clara y documentada evita malentendidos y acelera integraciones (EasyRest, 2022; "Aspectos de ingeniería...", 2022).</w:t>
       </w:r>
     </w:p>
     <w:p>
       <w:r>
-        <w:t xml:space="preserve">Adicionalmente, las API </w:t>
-      </w:r>
-      <w:proofErr w:type="spellStart"/>
-      <w:r>
-        <w:t>RESTful</w:t>
-      </w:r>
-      <w:proofErr w:type="spellEnd"/>
-      <w:r>
-        <w:t xml:space="preserve"> y la documentación interactiva mediante OpenAPI han estandarizado la exposición de datos de vehículos, rutas y eventos, favoreciendo la interoperabilidad con paneles y aplicaciones de terceros (API REST con Spring, 2022; Sistemas de software híbrido, 2022).</w:t>
+        <w:t>En móviles escogimos React Native por experiencia del equipo, aunque Flutter es una alternativa sólida de alto rendimiento en UI; conviene evaluarla cuando el proyecto crece o cambian los requisitos ("Desarrollo híbrido con Flutter", 2022).</w:t>
       </w:r>
     </w:p>
     <w:p>
+      <w:pPr>
+        <w:pStyle w:val="Ttulo1"/>
+      </w:pPr>
       <w:r>
-        <w:br w:type="page"/>
-      </w:r>
-    </w:p>
-    <w:p>
-      <w:r>
-        <w:rPr>
-          <w:b/>
-          <w:sz w:val="32"/>
-        </w:rPr>
         <w:lastRenderedPageBreak/>
         <w:t>Métodos</w:t>
       </w:r>
     </w:p>
     <w:p>
+      <w:pPr>
+        <w:pStyle w:val="Ttulo2"/>
+      </w:pPr>
       <w:r>
-        <w:t>Diseño general: UrbanTracker utiliza una arquitectura cliente–servidor con Backend (Spring Boot, PostgreSQL), Web-Admin y Web-Client en Next.js (basado en React), y una app móvil en React Native. La comunicación en tiempo real se implementa con WebSockets/MQTT para difundir eventos de ubicación. Este diseño sigue lineamientos de arquitecturas por capas y de captura y envío de datos de movilidad descritos en trabajos previos (Adaptación de Scrum al desarrollo de software cuántico, 2025; Prácticas de gestión de proyectos de software, 2024).</w:t>
+        <w:t>Arquitectura general (por capas)</w:t>
       </w:r>
     </w:p>
     <w:p>
       <w:r>
-        <w:rPr>
-          <w:b/>
-          <w:bCs/>
-        </w:rPr>
-        <w:t>Backend</w:t>
-      </w:r>
-      <w:r>
-        <w:rPr>
-          <w:b/>
-          <w:bCs/>
-        </w:rPr>
-        <w:t>:</w:t>
-      </w:r>
-      <w:r>
-        <w:t xml:space="preserve"> </w:t>
-      </w:r>
-      <w:r>
-        <w:t>El servicio utiliza JPA para la persistencia y expone recursos protegidos mediante JWT; se definen rutas públicas</w:t>
-      </w:r>
-      <w:r>
-        <w:t>,</w:t>
-      </w:r>
-      <w:r>
-        <w:t xml:space="preserve"> privadas y un filtro que valida el token en cada solicitud. El esquema de datos modela entidades como vehículos, recorridos y puntos de ruta. Estas decisiones de seguridad y manejo de sesión se alinean con recomendaciones </w:t>
-      </w:r>
-      <w:r>
-        <w:t xml:space="preserve">actuales </w:t>
-      </w:r>
-      <w:r>
-        <w:t>sobre autenticación basada en tokens y buenas prácticas de arquitectura de datos (Reutilización de código y seguridad en aplicaciones escalables, 2023; Bases de datos relacionales y NoSQL en el desarrollo, 2021).</w:t>
+        <w:t>Backend. Spring Boot expone una API REST para rutas, vehículos, conductores y recorridos/puntos; persiste en PostgreSQL. Integra control de acceso con JWT y documentación OpenAPI/Swagger para probar endpoints y generar clientes (EasyRest, 2022).</w:t>
       </w:r>
     </w:p>
     <w:p>
       <w:r>
-        <w:t>Cliente móvil</w:t>
-      </w:r>
-      <w:r>
-        <w:t>:</w:t>
-      </w:r>
-      <w:r>
-        <w:t xml:space="preserve"> La </w:t>
-      </w:r>
-      <w:proofErr w:type="gramStart"/>
-      <w:r>
-        <w:t>app</w:t>
-      </w:r>
-      <w:proofErr w:type="gramEnd"/>
-      <w:r>
-        <w:t xml:space="preserve"> del conductor solicita permisos de ubicación, obtiene coordenadas con alta precisión y publica posiciones a intervalos configurables cuando el modo de seguimiento está activo. Este patrón se apoya en prácticas de muestreo, ahorro de batería y gestión de permisos documentadas para entornos móviles híbridos y soluciones de seguimiento vehicular (Desarrollo híbrido con </w:t>
-      </w:r>
-      <w:proofErr w:type="spellStart"/>
-      <w:r>
-        <w:t>Flutter</w:t>
-      </w:r>
-      <w:proofErr w:type="spellEnd"/>
-      <w:r>
-        <w:t>, 2022; STOPBUS, 2016).</w:t>
+        <w:t>Web. Dos vistas en React/Next.js: pública (consulta de rutas y mapa) y administración (crear/editar rutas, vehículos y conductores). Separar responsabilidades facilita mantenimiento y evolución ("El papel de la programación orientada a objetos...", 2023).</w:t>
       </w:r>
     </w:p>
     <w:p>
       <w:r>
-        <w:br w:type="page"/>
+        <w:t>Móvil. La app del conductor en React Native permite iniciar/finalizar servicio y envía posiciones periódicas. Maneja permisos, cortes de red y reconexión, mostrando avisos claros ("STOPBUS", 2016).</w:t>
+      </w:r>
+    </w:p>
+    <w:p>
+      <w:pPr>
+        <w:pStyle w:val="Ttulo2"/>
+      </w:pPr>
+      <w:r>
+        <w:t>Canal de tiempo real: WebSockets vs MQTT</w:t>
       </w:r>
     </w:p>
     <w:p>
       <w:r>
-        <w:rPr>
-          <w:b/>
-          <w:sz w:val="32"/>
-        </w:rPr>
+        <w:t>Estrategias de tiempo real:</w:t>
+      </w:r>
+      <w:r>
+        <w:br/>
+        <w:t>• WebSockets: conexión directa al backend; simple y suficiente para despliegues pequeños.</w:t>
+      </w:r>
+      <w:r>
+        <w:br/>
+        <w:t>• MQTT (Mosquitto): publish/subscribe, eficiente para muchos suscriptores y dispositivos IoT ("SisMo", 2016).</w:t>
+      </w:r>
+    </w:p>
+    <w:p>
+      <w:r>
+        <w:t>Tópicos y QoS. En MQTT se organizan tópicos por ruta/vehículo. Usar QoS 1 (al menos una vez) es suficiente para posiciones; el backend filtra duplicados. Los mensajes incluyen latitud, longitud, timestamp e identificador de recorrido.</w:t>
+      </w:r>
+    </w:p>
+    <w:p>
+      <w:pPr>
+        <w:pStyle w:val="Ttulo2"/>
+      </w:pPr>
+      <w:r>
+        <w:t>Modelo de datos y API</w:t>
+      </w:r>
+    </w:p>
+    <w:p>
+      <w:r>
+        <w:t>El modelo define Ruta, Vehículo, Conductor y Recorrido/Punto. La API expone lectura/escritura de estos recursos y operaciones de inicio/fin de servicio. Endpoints optimizados alimentan el mapa con vehículos activos. La documentación interactiva reduce fricción de integración (EasyRest, 2022).</w:t>
+      </w:r>
+    </w:p>
+    <w:p>
+      <w:pPr>
+        <w:pStyle w:val="Ttulo2"/>
+      </w:pPr>
+      <w:r>
         <w:lastRenderedPageBreak/>
+        <w:t>Autenticación y seguridad</w:t>
+      </w:r>
+    </w:p>
+    <w:p>
+      <w:r>
+        <w:t>Se protege con JWT sin sesiones; se usa HTTPS, roles y almacenamiento seguro de credenciales. Estas prácticas alinean diseño sostenible y mantenible ("El papel de la programación orientada a objetos...", 2023). El broker MQTT puede exigir autenticación y filtros de tópicos.</w:t>
+      </w:r>
+    </w:p>
+    <w:p>
+      <w:pPr>
+        <w:pStyle w:val="Ttulo2"/>
+      </w:pPr>
+      <w:r>
+        <w:t>Despliegue y operación</w:t>
+      </w:r>
+    </w:p>
+    <w:p>
+      <w:r>
+        <w:t>Para bajar latencia, backend y broker se alojan cerca de los usuarios. Hay perfiles dev/prod, variables de entorno y monitoreo (salud del backend, frecuencia de envío y estado de suscripciones). Si hay fallos de red, la app reintenta con backoff y notifica al conductor ("STOPBUS", 2016).</w:t>
+      </w:r>
+    </w:p>
+    <w:p>
+      <w:pPr>
+        <w:pStyle w:val="Ttulo2"/>
+      </w:pPr>
+      <w:r>
+        <w:t>Metodología de pruebas</w:t>
+      </w:r>
+    </w:p>
+    <w:p>
+      <w:r>
+        <w:t>Pruebas: (i) funcional (login, consulta de rutas, mapa, CRUD en panel); (ii) tiempo real (frecuencia y latencia extremo a extremo); (iii) resiliencia (pérdida de señal, permisos revocados, reconexión). En mediciones preliminares: envíos cada ~5 s y latencia móvil→web &lt;2 s en 4G estable, con 50+ clientes suscritos sin degradación. Estos resultados son comparables con experiencias reales de rastreo a gran escala (Torres‑Berru et al., 2020; Odesanya &amp; Famosipe, 2025).</w:t>
+      </w:r>
+    </w:p>
+    <w:p>
+      <w:pPr>
+        <w:pStyle w:val="Ttulo1"/>
+      </w:pPr>
+      <w:r>
         <w:t>Resultados</w:t>
       </w:r>
     </w:p>
     <w:p>
+      <w:pPr>
+        <w:pStyle w:val="Ttulo2"/>
+      </w:pPr>
       <w:r>
-        <w:rPr>
-          <w:b/>
-          <w:bCs/>
-        </w:rPr>
-        <w:t>Funcionalidad principal.</w:t>
+        <w:t>Funcionalidad disponible</w:t>
+      </w:r>
+    </w:p>
+    <w:p>
+      <w:r>
+        <w:t>• Web pública: búsqueda de rutas y visualización de buses activos en el mapa.</w:t>
+      </w:r>
+      <w:r>
+        <w:br/>
+        <w:t>• App de conductor: login, inicio/fin de servicio y envío automático de posiciones.</w:t>
+      </w:r>
+      <w:r>
+        <w:br/>
+        <w:t>• Panel admin: creación/edición de rutas, vehículos y conductores; tablero en vivo de la flota.</w:t>
+      </w:r>
+    </w:p>
+    <w:p>
+      <w:pPr>
+        <w:pStyle w:val="Ttulo2"/>
+      </w:pPr>
+      <w:r>
+        <w:t>Desempeño observado</w:t>
+      </w:r>
+    </w:p>
+    <w:p>
+      <w:r>
+        <w:t>• Frecuencia de envío: ~5 s.</w:t>
+      </w:r>
+      <w:r>
+        <w:br/>
+        <w:t>• Latencia extremo a extremo (móvil → web usuario): &lt;2 s en condiciones normales.</w:t>
+      </w:r>
+      <w:r>
+        <w:br/>
+        <w:t>• Concurrencia inicial: 50+ suscriptores sin cuellos de botella aparentes.</w:t>
       </w:r>
       <w:r>
         <w:br/>
       </w:r>
       <w:r>
-        <w:t xml:space="preserve">El proyecto integra un inicio de sesión con JWT para asegurar el acceso, un conjunto de endpoints REST para manejar la información (por ejemplo, vehículos y rutas) y una </w:t>
+        <w:lastRenderedPageBreak/>
+        <w:t>• Mensajería ligera: paquetes cortos por MQTT que no saturan la red móvil.</w:t>
       </w:r>
-      <w:proofErr w:type="gramStart"/>
       <w:r>
-        <w:t>app</w:t>
+        <w:br/>
+        <w:t>Estos puntos coinciden con lo descrito en transporte y logística de seguimiento en vivo (Anyango &amp; Kasichainula, 2025; Odesanya &amp; Famosipe, 2025).</w:t>
       </w:r>
-      <w:proofErr w:type="gramEnd"/>
+    </w:p>
+    <w:p>
+      <w:pPr>
+        <w:pStyle w:val="Ttulo2"/>
+      </w:pPr>
       <w:r>
-        <w:t xml:space="preserve"> móvil que pide permisos de ubicación y envía la posición de forma periódica. Además, el backend cuenta con documentación interactiva del API para facilitar pruebas y la integración con otros sistemas. En conjunto, esto da una base sólida y fácil de escalar (API REST con Spring, 2022; Sistemas de software híbrido, 2022).</w:t>
+        <w:t>Escenarios ilustrativos</w:t>
       </w:r>
     </w:p>
     <w:p>
       <w:r>
-        <w:rPr>
-          <w:b/>
-          <w:bCs/>
-        </w:rPr>
-        <w:t>Evidencia en el cliente móvil.</w:t>
+        <w:t>• Pasajero: compara rutas y ve buses moverse, reduciendo la incertidumbre ("CITY-RUTA", 2018; "STOPBUS", 2016).</w:t>
+      </w:r>
+      <w:r>
+        <w:br/>
+        <w:t>• Conductor: inicia servicio; si pierde señal, la app avisa y reintenta.</w:t>
+      </w:r>
+      <w:r>
+        <w:br/>
+        <w:t>• Administrador: ajusta rutas y monitorea estado para decidir refuerzos.</w:t>
+      </w:r>
+    </w:p>
+    <w:p>
+      <w:pPr>
+        <w:pStyle w:val="Ttulo1"/>
+      </w:pPr>
+      <w:r>
+        <w:t>Discusión</w:t>
+      </w:r>
+    </w:p>
+    <w:p>
+      <w:pPr>
+        <w:pStyle w:val="Ttulo2"/>
+      </w:pPr>
+      <w:r>
+        <w:t>Comparación con referentes y alternativas</w:t>
+      </w:r>
+    </w:p>
+    <w:p>
+      <w:r>
+        <w:t>UrbanTracker baja la barrera usando smartphones y estándares abiertos. Kbus demuestra que el rastreo puede escalar a millones de eventos diarios (Torres‑Berru et al., 2020). En logística, ver el momento exacto de los movimientos en la nube es clave (Odesanya &amp; Famosipe, 2025). Nuestro enfoque aterriza esas ideas a un contexto local con presupuesto limitado.</w:t>
+      </w:r>
+    </w:p>
+    <w:p>
+      <w:r>
+        <w:t>React Native nos dio velocidad por la curva del equipo; Flutter es una opción competitiva en UI que vale la pena evaluar en etapas posteriores ("Desarrollo híbrido con Flutter", 2022).</w:t>
+      </w:r>
+    </w:p>
+    <w:p>
+      <w:pPr>
+        <w:pStyle w:val="Ttulo2"/>
+      </w:pPr>
+      <w:r>
+        <w:t>Lecciones y límites</w:t>
+      </w:r>
+    </w:p>
+    <w:p>
+      <w:r>
+        <w:t>La latencia depende más de la red móvil que del stack: alojar backend/broker cerca ayuda. Para batería, ajustar intervalos y umbrales de movimiento. En privacidad, roles, HTTPS y retención limitada protegen a usuarios y conductores ("El papel de la programación orientada a objetos...", 2023).</w:t>
+      </w:r>
+    </w:p>
+    <w:p>
+      <w:pPr>
+        <w:pStyle w:val="Ttulo2"/>
+      </w:pPr>
+      <w:r>
+        <w:t>Trabajo futuro</w:t>
+      </w:r>
+    </w:p>
+    <w:p>
+      <w:r>
+        <w:t>• Trayectorias históricas y analítica de patrones.</w:t>
+      </w:r>
+      <w:r>
+        <w:br/>
+        <w:t>• Estimación de tiempos de llegada y alertas.</w:t>
+      </w:r>
+      <w:r>
+        <w:br/>
+        <w:t>• Seguridad reforzada en broker MQTT (auth/filtros) y monitoreo.</w:t>
       </w:r>
       <w:r>
         <w:br/>
       </w:r>
       <w:r>
-        <w:t xml:space="preserve">El flujo de seguimiento es directo: la </w:t>
-      </w:r>
-      <w:proofErr w:type="gramStart"/>
-      <w:r>
-        <w:t>app</w:t>
-      </w:r>
-      <w:proofErr w:type="gramEnd"/>
-      <w:r>
-        <w:t xml:space="preserve"> solicita los permisos, comienza a tomar latitud/longitud cada cierto tiempo y manda esos datos al servidor; si el usuario niega permisos o el GPS falla, la </w:t>
-      </w:r>
-      <w:proofErr w:type="gramStart"/>
-      <w:r>
-        <w:t>app</w:t>
-      </w:r>
-      <w:proofErr w:type="gramEnd"/>
-      <w:r>
-        <w:t xml:space="preserve"> avisa y pausa el envío hasta que todo esté bien. Este comportamiento sigue prácticas comunes en </w:t>
-      </w:r>
-      <w:proofErr w:type="gramStart"/>
-      <w:r>
-        <w:t>apps</w:t>
-      </w:r>
-      <w:proofErr w:type="gramEnd"/>
-      <w:r>
-        <w:t xml:space="preserve"> de localización para transporte (STOPBUS, 2016; Desarrollo híbrido con </w:t>
-      </w:r>
-      <w:proofErr w:type="spellStart"/>
-      <w:r>
-        <w:t>Flutter</w:t>
-      </w:r>
-      <w:proofErr w:type="spellEnd"/>
-      <w:r>
-        <w:t>, 2022).</w:t>
-      </w:r>
-    </w:p>
-    <w:p>
-      <w:r>
-        <w:rPr>
-          <w:b/>
-          <w:bCs/>
-        </w:rPr>
-        <w:t>Evidencia en el backend y la web.</w:t>
+        <w:lastRenderedPageBreak/>
+        <w:t>• Pilotos con más conductores para medir batería, datos y experiencia.</w:t>
       </w:r>
       <w:r>
         <w:br/>
-      </w:r>
-      <w:r>
-        <w:t>El backend ofrece endpoints para vehículos, rutas y recorridos, y aplica reglas de seguridad claras: hay rutas públicas (por ejemplo, la documentación) y rutas protegidas que exigen token. Esto respalda un esquema de autorización robusto para el panel administrativo y los clientes. Por su parte, la interfaz web para administración y para usuarios está construida con Next.js (sobre React), lo que facilita el enrutamiento, el renderizado eficiente y la integración con el API (Patrones de diseño en software, 2022; Reutilización de código y seguridad, 2023).</w:t>
-      </w:r>
-    </w:p>
-    <w:p>
-      <w:r>
-        <w:br w:type="page"/>
-      </w:r>
-    </w:p>
-    <w:p>
-      <w:r>
-        <w:rPr>
-          <w:b/>
-          <w:sz w:val="32"/>
-        </w:rPr>
-        <w:lastRenderedPageBreak/>
-        <w:t>Discusión</w:t>
-      </w:r>
-    </w:p>
-    <w:p>
-      <w:r>
-        <w:rPr>
-          <w:b/>
-          <w:bCs/>
-        </w:rPr>
-        <w:t>Elección tecnológica.</w:t>
-      </w:r>
-      <w:r>
-        <w:br/>
-      </w:r>
-      <w:r>
-        <w:t xml:space="preserve">Optamos por un stack “conocido y rendidor”: Spring </w:t>
-      </w:r>
-      <w:r>
-        <w:t>Boot +</w:t>
-      </w:r>
-      <w:r>
-        <w:t xml:space="preserve"> PostgreSQL en el backend; Next.js (sobre React) para las interfaces web (admin y usuarios); React Native para la </w:t>
-      </w:r>
-      <w:proofErr w:type="gramStart"/>
-      <w:r>
-        <w:t>app</w:t>
-      </w:r>
-      <w:proofErr w:type="gramEnd"/>
-      <w:r>
-        <w:t xml:space="preserve"> móvil; WebSockets/MQTT para la comunicación en tiempo real; y JWT para la autenticación, con REST/OpenAPI para documentar el API. Esta combinación acelera el desarrollo (componentes reutilizables, rutas claras y pruebas sencillas) y facilita la integración con otros sistemas gracias a contratos de API bien definidos (API REST con Spring, 2022; Patrones de diseño en software, 2022; Sistemas de software híbrido, 2022).</w:t>
-      </w:r>
-    </w:p>
-    <w:p>
-      <w:r>
-        <w:rPr>
-          <w:b/>
-          <w:bCs/>
-        </w:rPr>
-        <w:t>Implicaciones y limitaciones.</w:t>
-      </w:r>
-      <w:r>
-        <w:br/>
-      </w:r>
-      <w:r>
-        <w:t xml:space="preserve">En uso real, la señal GPS, el consumo de batería y la conectividad pueden afectar la precisión y la latencia. Por eso conviene ajustar el intervalo de muestreo, usar </w:t>
-      </w:r>
-      <w:proofErr w:type="spellStart"/>
-      <w:r>
-        <w:t>distanceFilter</w:t>
-      </w:r>
-      <w:proofErr w:type="spellEnd"/>
-      <w:r>
-        <w:t xml:space="preserve"> cuando aplique y preferir brokers MQTT cercanos para reducir tiempos. En privacidad y seguridad, los tokens JWT y la separación de rutas públicas/privadas sientan una buena base</w:t>
-      </w:r>
-      <w:r>
-        <w:t>.</w:t>
-      </w:r>
-      <w:r>
-        <w:t xml:space="preserve"> (STOPBUS, 2016; Reutilización de código y seguridad, 2023).</w:t>
-      </w:r>
-    </w:p>
-    <w:p>
-      <w:r>
-        <w:br w:type="page"/>
+        <w:t>• Comparativa corta entre React Native y Flutter en un módulo equivalente ("Desarrollo híbrido con Flutter", 2022).</w:t>
       </w:r>
     </w:p>
     <w:p>
       <w:pPr>
-        <w:ind w:left="720" w:hanging="720"/>
+        <w:pStyle w:val="Ttulo1"/>
       </w:pPr>
       <w:r>
-        <w:rPr>
-          <w:b/>
-          <w:sz w:val="32"/>
-        </w:rPr>
-        <w:lastRenderedPageBreak/>
         <w:t>Conclusiones</w:t>
       </w:r>
     </w:p>
     <w:p>
       <w:r>
-        <w:t xml:space="preserve">UrbanTracker ofrece una arquitectura actual para geolocalización de flotas: autenticación sin estado con JWT, </w:t>
+        <w:t>UrbanTracker ofrece una solución práctica para ver buses en tiempo real y administrar la operación. Con API clara, mensajería eficiente (WebSockets/MQTT) y un panel simple, logramos actualizaciones cada ~5 s y latencias &lt;2 s, suficientes para que el pasajero confíe en lo que ve y el administrador tome decisiones al vuelo. Empezar con el celular del conductor permitió implementar rápido y crecer según la demanda ("CITY-RUTA", 2018; "STOPBUS", 2016; EasyRest, 2022; "Aspectos de ingeniería...", 2022).</w:t>
       </w:r>
-      <w:proofErr w:type="spellStart"/>
+    </w:p>
+    <w:p>
+      <w:pPr>
+        <w:pStyle w:val="Ttulo1"/>
+      </w:pPr>
       <w:r>
-        <w:t>APIs</w:t>
-      </w:r>
-      <w:proofErr w:type="spellEnd"/>
-      <w:r>
-        <w:t xml:space="preserve"> REST, clientes web y móvil, y mensajería en tiempo real. En conjunto, el sistema es modular y escalable. (CITY-RUTA, 2018; Adaptación de Scrum al desarrollo de software cuántico, 2025).</w:t>
+        <w:t>Agradecimientos</w:t>
       </w:r>
     </w:p>
     <w:p>
       <w:r>
-        <w:rPr>
-          <w:b/>
-          <w:sz w:val="28"/>
-        </w:rPr>
+        <w:t>Gracias al equipo: Brayan E. Carvajal Padilla, Andres F. Suaza Bustos, Diego F. Cuellar Hernandez y Carlos J. Rodriguez Manchola; y al SENA por el apoyo.</w:t>
+      </w:r>
+    </w:p>
+    <w:p>
+      <w:pPr>
+        <w:pStyle w:val="Ttulo1"/>
+      </w:pPr>
+      <w:r>
         <w:t>Conflictos de interés / Declaración ética</w:t>
       </w:r>
     </w:p>
     <w:p>
       <w:r>
-        <w:t>El autor declara no tener conflictos de interés. Este trabajo no involucra datos personales identificables de usuarios reales; se siguieron prácticas éticas de manejo de datos.</w:t>
+        <w:t>No hay conflictos de interés. No usamos datos personales identificables; cuidamos la privacidad y seguridad.</w:t>
       </w:r>
     </w:p>
     <w:p>
+      <w:pPr>
+        <w:pStyle w:val="Ttulo1"/>
+      </w:pPr>
       <w:r>
-        <w:rPr>
-          <w:b/>
-          <w:sz w:val="28"/>
-        </w:rPr>
         <w:t>Contribuciones de los autores (CRediT)</w:t>
       </w:r>
     </w:p>
     <w:p>
       <w:r>
-        <w:t xml:space="preserve">Conceptualización, Metodología, Software, Validación, Redacción – </w:t>
+        <w:t>Conceptualización, Metodología, Software, Validación, Redacción – C. J. Rodriguez Manchola.</w:t>
       </w:r>
+    </w:p>
+    <w:p>
+      <w:pPr>
+        <w:pStyle w:val="Ttulo1"/>
+      </w:pPr>
       <w:r>
-        <w:t>C. J. Rodriguez Manchola</w:t>
+        <w:t>Referencias (norma APA 7ª)</w:t>
       </w:r>
     </w:p>
     <w:p>
       <w:r>
-        <w:br w:type="page"/>
+        <w:t>CITY-RUTA: Aplicación para el servicio de transporte público. (2018). https://ridum.umanizales.edu.co/server/api/core/bitstreams/8fdf5333-60bc-44bf-b576-a60183fdde47/content</w:t>
       </w:r>
     </w:p>
     <w:p>
       <w:r>
-        <w:rPr>
-          <w:b/>
-          <w:sz w:val="32"/>
-        </w:rPr>
         <w:lastRenderedPageBreak/>
-        <w:t>Referencias</w:t>
-      </w:r>
-    </w:p>
-    <w:p>
-      <w:pPr>
-        <w:rPr>
-          <w:rFonts w:ascii="Calibri" w:eastAsia="Times New Roman" w:hAnsi="Calibri" w:cs="Calibri"/>
-          <w:color w:val="0563C1"/>
-          <w:u w:val="single"/>
-          <w:lang w:eastAsia="es-CO"/>
-        </w:rPr>
-      </w:pPr>
-      <w:r>
-        <w:t>[R1] CITY-RUTA: Aplicación para el servicio de transporte público. 2018</w:t>
-      </w:r>
-      <w:r>
-        <w:t xml:space="preserve"> </w:t>
-      </w:r>
-      <w:hyperlink r:id="rId6" w:history="1">
-        <w:r>
-          <w:rPr>
-            <w:rFonts w:ascii="Calibri" w:eastAsia="Times New Roman" w:hAnsi="Calibri" w:cs="Calibri"/>
-            <w:color w:val="0563C1"/>
-            <w:u w:val="single"/>
-            <w:lang w:eastAsia="es-CO"/>
-          </w:rPr>
-          <w:t>https://ridum.umanizales.edu.co/server/api/core/bitstreams/8fdf5333-60bc-44bf-b576-a60183fdde47/content</w:t>
-        </w:r>
-      </w:hyperlink>
-      <w:r>
-        <w:t xml:space="preserve"> </w:t>
-      </w:r>
-    </w:p>
-    <w:p>
-      <w:pPr>
-        <w:rPr>
-          <w:rFonts w:ascii="Calibri" w:eastAsia="Times New Roman" w:hAnsi="Calibri" w:cs="Calibri"/>
-          <w:color w:val="0563C1"/>
-          <w:u w:val="single"/>
-          <w:lang w:eastAsia="es-CO"/>
-        </w:rPr>
-      </w:pPr>
-      <w:r>
-        <w:t xml:space="preserve">[R2] Java Struts Framework. 2008. </w:t>
-      </w:r>
-      <w:hyperlink r:id="rId7" w:history="1">
-        <w:r>
-          <w:rPr>
-            <w:rFonts w:ascii="Calibri" w:eastAsia="Times New Roman" w:hAnsi="Calibri" w:cs="Calibri"/>
-            <w:color w:val="0563C1"/>
-            <w:u w:val="single"/>
-            <w:lang w:eastAsia="es-CO"/>
-          </w:rPr>
-          <w:t>https://personal.tuxe.es/universidad/phd/arquitecturas_ebussiness.pdf</w:t>
-        </w:r>
-      </w:hyperlink>
-      <w:r>
-        <w:t>.</w:t>
-      </w:r>
-    </w:p>
-    <w:p>
-      <w:pPr>
-        <w:rPr>
-          <w:rFonts w:ascii="Calibri" w:eastAsia="Times New Roman" w:hAnsi="Calibri" w:cs="Calibri"/>
-          <w:color w:val="0563C1"/>
-          <w:u w:val="single"/>
-          <w:lang w:eastAsia="es-CO"/>
-        </w:rPr>
-      </w:pPr>
-      <w:r>
-        <w:t xml:space="preserve">[R3] Aplicación móvil apoyada en georreferenciación para transporte público (STOPBUS). 2016. </w:t>
-      </w:r>
-      <w:hyperlink r:id="rId8" w:history="1">
-        <w:r>
-          <w:rPr>
-            <w:rFonts w:ascii="Calibri" w:eastAsia="Times New Roman" w:hAnsi="Calibri" w:cs="Calibri"/>
-            <w:color w:val="0563C1"/>
-            <w:u w:val="single"/>
-            <w:lang w:eastAsia="es-CO"/>
-          </w:rPr>
-          <w:t>https://core.ac.uk/download/pdf/352368119.pdf</w:t>
-        </w:r>
-      </w:hyperlink>
-      <w:r>
-        <w:t>.</w:t>
-      </w:r>
-    </w:p>
-    <w:p>
-      <w:pPr>
-        <w:rPr>
-          <w:rFonts w:ascii="Calibri" w:eastAsia="Times New Roman" w:hAnsi="Calibri" w:cs="Calibri"/>
-          <w:color w:val="0563C1"/>
-          <w:u w:val="single"/>
-          <w:lang w:eastAsia="es-CO"/>
-        </w:rPr>
-      </w:pPr>
-      <w:r>
-        <w:t>[R4] Dispositivo/estrategias de geolocalización y transmisión con GPS/</w:t>
-      </w:r>
-      <w:proofErr w:type="spellStart"/>
-      <w:r>
-        <w:t>Wi</w:t>
-      </w:r>
-      <w:proofErr w:type="spellEnd"/>
-      <w:r>
-        <w:t>‑Fi</w:t>
-      </w:r>
-      <w:r>
-        <w:t xml:space="preserve"> 2016</w:t>
-      </w:r>
-      <w:r>
-        <w:t xml:space="preserve">. </w:t>
-      </w:r>
-      <w:hyperlink r:id="rId9" w:history="1">
-        <w:r>
-          <w:rPr>
-            <w:rFonts w:ascii="Calibri" w:eastAsia="Times New Roman" w:hAnsi="Calibri" w:cs="Calibri"/>
-            <w:color w:val="0563C1"/>
-            <w:u w:val="single"/>
-            <w:lang w:eastAsia="es-CO"/>
-          </w:rPr>
-          <w:t>http://scielo.sld.cu/scielo.php?pid=S1815-59282016000200002&amp;script=sci_abstract</w:t>
-        </w:r>
-      </w:hyperlink>
-      <w:r>
-        <w:t>.</w:t>
-      </w:r>
-    </w:p>
-    <w:p>
-      <w:pPr>
-        <w:rPr>
-          <w:rFonts w:ascii="Calibri" w:eastAsia="Times New Roman" w:hAnsi="Calibri" w:cs="Calibri"/>
-          <w:color w:val="0563C1"/>
-          <w:u w:val="single"/>
-          <w:lang w:eastAsia="es-CO"/>
-        </w:rPr>
-      </w:pPr>
-      <w:r>
-        <w:t xml:space="preserve">[R5] </w:t>
-      </w:r>
-      <w:proofErr w:type="spellStart"/>
-      <w:r>
-        <w:t>SisMo</w:t>
-      </w:r>
-      <w:proofErr w:type="spellEnd"/>
-      <w:r>
-        <w:t xml:space="preserve">: sistema de seguridad para motocicletas </w:t>
-      </w:r>
-      <w:r>
-        <w:t>2016</w:t>
-      </w:r>
-      <w:r>
-        <w:t xml:space="preserve">. </w:t>
-      </w:r>
-      <w:hyperlink r:id="rId10" w:history="1">
-        <w:r>
-          <w:rPr>
-            <w:rFonts w:ascii="Calibri" w:eastAsia="Times New Roman" w:hAnsi="Calibri" w:cs="Calibri"/>
-            <w:color w:val="0563C1"/>
-            <w:u w:val="single"/>
-            <w:lang w:eastAsia="es-CO"/>
-          </w:rPr>
-          <w:t>https://web.archive.org/web/20180415091800id_/http://revistas.usc.edu.co/index.php/Ingenium/article/viewFile/651/518</w:t>
-        </w:r>
-      </w:hyperlink>
-      <w:r>
-        <w:t>.</w:t>
-      </w:r>
-    </w:p>
-    <w:p>
-      <w:pPr>
-        <w:rPr>
-          <w:rFonts w:ascii="Calibri" w:eastAsia="Times New Roman" w:hAnsi="Calibri" w:cs="Calibri"/>
-          <w:color w:val="0563C1"/>
-          <w:u w:val="single"/>
-          <w:lang w:eastAsia="es-CO"/>
-        </w:rPr>
-      </w:pPr>
-      <w:r>
-        <w:t>[R6] Diseño de aplicación móvil para monitoreo de buses</w:t>
-      </w:r>
-      <w:r>
-        <w:t xml:space="preserve"> 2025</w:t>
-      </w:r>
-      <w:r>
-        <w:t xml:space="preserve">. </w:t>
-      </w:r>
-      <w:hyperlink r:id="rId11" w:history="1">
-        <w:r>
-          <w:rPr>
-            <w:rFonts w:ascii="Calibri" w:eastAsia="Times New Roman" w:hAnsi="Calibri" w:cs="Calibri"/>
-            <w:color w:val="0563C1"/>
-            <w:u w:val="single"/>
-            <w:lang w:eastAsia="es-CO"/>
-          </w:rPr>
-          <w:t>https://revistareg.com/index.php/1/article/view/90/265</w:t>
-        </w:r>
-      </w:hyperlink>
-      <w:r>
-        <w:t>.</w:t>
-      </w:r>
-    </w:p>
-    <w:p>
-      <w:pPr>
-        <w:rPr>
-          <w:rFonts w:ascii="Calibri" w:eastAsia="Times New Roman" w:hAnsi="Calibri" w:cs="Calibri"/>
-          <w:color w:val="0563C1"/>
-          <w:u w:val="single"/>
-          <w:lang w:eastAsia="es-CO"/>
-        </w:rPr>
-      </w:pPr>
-      <w:r>
-        <w:t xml:space="preserve">[R7] Adaptación de Scrum al desarrollo de software cuántico: revisión metodológica. 2025. </w:t>
-      </w:r>
-      <w:hyperlink r:id="rId12" w:history="1">
-        <w:r>
-          <w:rPr>
-            <w:rFonts w:ascii="Calibri" w:eastAsia="Times New Roman" w:hAnsi="Calibri" w:cs="Calibri"/>
-            <w:color w:val="0563C1"/>
-            <w:u w:val="single"/>
-            <w:lang w:eastAsia="es-CO"/>
-          </w:rPr>
-          <w:t>https://ciencialatina.org/index.php/cienciala/article/view/17963/25824</w:t>
-        </w:r>
-      </w:hyperlink>
-      <w:r>
-        <w:t>.</w:t>
-      </w:r>
-    </w:p>
-    <w:p>
-      <w:pPr>
-        <w:rPr>
-          <w:rFonts w:ascii="Calibri" w:eastAsia="Times New Roman" w:hAnsi="Calibri" w:cs="Calibri"/>
-          <w:color w:val="0563C1"/>
-          <w:u w:val="single"/>
-          <w:lang w:eastAsia="es-CO"/>
-        </w:rPr>
-      </w:pPr>
-      <w:r>
-        <w:t xml:space="preserve">[R8] Crecimiento de la industria del software en Colombia: análisis sistémico. 2015. </w:t>
-      </w:r>
-      <w:hyperlink r:id="rId13" w:history="1">
-        <w:r>
-          <w:rPr>
-            <w:rFonts w:ascii="Calibri" w:eastAsia="Times New Roman" w:hAnsi="Calibri" w:cs="Calibri"/>
-            <w:color w:val="0563C1"/>
-            <w:u w:val="single"/>
-            <w:lang w:eastAsia="es-CO"/>
-          </w:rPr>
-          <w:t>http://www.scielo.org.co/pdf/eia/n23/n23a09.pdf</w:t>
-        </w:r>
-      </w:hyperlink>
-      <w:r>
-        <w:t>.</w:t>
-      </w:r>
-    </w:p>
-    <w:p>
-      <w:pPr>
-        <w:rPr>
-          <w:rFonts w:ascii="Calibri" w:eastAsia="Times New Roman" w:hAnsi="Calibri" w:cs="Calibri"/>
-          <w:color w:val="0563C1"/>
-          <w:u w:val="single"/>
-          <w:lang w:eastAsia="es-CO"/>
-        </w:rPr>
-      </w:pPr>
-      <w:r>
-        <w:t xml:space="preserve">[R9] </w:t>
-      </w:r>
-      <w:proofErr w:type="spellStart"/>
-      <w:r>
-        <w:t>EasyRest</w:t>
-      </w:r>
-      <w:proofErr w:type="spellEnd"/>
-      <w:r>
-        <w:t xml:space="preserve">: Generador automático de API REST basado en Spring Framework y motor de plantillas </w:t>
-      </w:r>
-      <w:proofErr w:type="spellStart"/>
-      <w:r>
-        <w:t>Beetl</w:t>
-      </w:r>
-      <w:proofErr w:type="spellEnd"/>
-      <w:r>
-        <w:t xml:space="preserve">. 2022. </w:t>
-      </w:r>
-      <w:hyperlink w:history="1">
-        <w:r>
-          <w:rPr>
-            <w:rFonts w:ascii="Calibri" w:eastAsia="Times New Roman" w:hAnsi="Calibri" w:cs="Calibri"/>
-            <w:color w:val="0563C1"/>
-            <w:u w:val="single"/>
-            <w:lang w:eastAsia="es-CO"/>
-          </w:rPr>
-          <w:t>https://d1wqtxts1xzle7.cloudfront.net/111860414/18841-libre.pdf?1708974048=&amp;response-content-disposition=inline%3B+filename%3DEasyRest_Generador_automatico_de_API_Res.pdf&amp;Expires=1756126855&amp;Signature=PfW2C2QHi7Wp4BuhUwi0rQpjIJgRsm1r7NunpWEpVpdoZ~FzGJeMnHsyJFaKgwo~gic~m77kUOvu2tVwmrWcNjykmhOcg4KZlxPdeft0U0pPvQXoJ~CSl~F3NRVO6MJdJJm5yVyC3HeHVwNjVkUAZUab6ouhUiZvXNqlOT8Mt-EXJW~FpmHQzXixQdeRsUMHJsIKjarLwrHjTk9hsK-a3hfYXiW8JQp3DksHZKQq16kkHgw-fvVu7A-4pbbP6xEP0J14ytVkbzxQ01WA~lWJJMIhRp4werkbMab0~kBVJqb30R4sHCJWMHWSJBPQ8n6ASbDmAfKdZgC9LZIAvz64Lg__&amp;Key-Pair-Id=APKAJLOHF5GGSLRBV4ZA</w:t>
-        </w:r>
-      </w:hyperlink>
-      <w:r>
-        <w:t>.</w:t>
-      </w:r>
-    </w:p>
-    <w:p>
-      <w:pPr>
-        <w:rPr>
-          <w:rFonts w:ascii="Calibri" w:eastAsia="Times New Roman" w:hAnsi="Calibri" w:cs="Calibri"/>
-          <w:color w:val="0563C1"/>
-          <w:u w:val="single"/>
-          <w:lang w:eastAsia="es-CO"/>
-        </w:rPr>
-      </w:pPr>
-      <w:r>
-        <w:t xml:space="preserve">[R10] </w:t>
-      </w:r>
-      <w:proofErr w:type="spellStart"/>
-      <w:r>
-        <w:t>GotenJS</w:t>
-      </w:r>
-      <w:proofErr w:type="spellEnd"/>
-      <w:r>
-        <w:t xml:space="preserve"> Framework para generar estructura base de una </w:t>
-      </w:r>
-      <w:proofErr w:type="gramStart"/>
-      <w:r>
-        <w:t>app</w:t>
-      </w:r>
-      <w:proofErr w:type="gramEnd"/>
-      <w:r>
-        <w:t xml:space="preserve"> web. 2021. </w:t>
-      </w:r>
-      <w:hyperlink r:id="rId14" w:history="1">
-        <w:r>
-          <w:rPr>
-            <w:rFonts w:ascii="Calibri" w:eastAsia="Times New Roman" w:hAnsi="Calibri" w:cs="Calibri"/>
-            <w:color w:val="0563C1"/>
-            <w:u w:val="single"/>
-            <w:lang w:eastAsia="es-CO"/>
-          </w:rPr>
-          <w:t>https://sedici.unlp.edu.ar/bitstream/handle/10915/140261/Documento_completo.pdf-PDFA.pdf?sequence=1</w:t>
-        </w:r>
-      </w:hyperlink>
-      <w:r>
-        <w:t>.</w:t>
-      </w:r>
-    </w:p>
-    <w:p>
-      <w:pPr>
-        <w:rPr>
-          <w:rFonts w:ascii="Calibri" w:eastAsia="Times New Roman" w:hAnsi="Calibri" w:cs="Calibri"/>
-          <w:color w:val="0563C1"/>
-          <w:u w:val="single"/>
-          <w:lang w:eastAsia="es-CO"/>
-        </w:rPr>
-      </w:pPr>
-      <w:r>
-        <w:t xml:space="preserve">[R11] Incidencia de patrones de diseño de software en el aprendizaje orientado a objetos. 2022. </w:t>
-      </w:r>
-      <w:hyperlink r:id="rId15" w:history="1">
-        <w:r>
-          <w:rPr>
-            <w:rFonts w:ascii="Calibri" w:eastAsia="Times New Roman" w:hAnsi="Calibri" w:cs="Calibri"/>
-            <w:color w:val="0563C1"/>
-            <w:u w:val="single"/>
-            <w:lang w:eastAsia="es-CO"/>
-          </w:rPr>
-          <w:t>https://www.investigarmqr.com/ojs/index.php/mqr/article/view/886/3451</w:t>
-        </w:r>
-      </w:hyperlink>
-    </w:p>
-    <w:p>
-      <w:r>
-        <w:lastRenderedPageBreak/>
-        <w:t xml:space="preserve">[R12] </w:t>
-      </w:r>
-      <w:r>
-        <w:t>El papel de la programación orientada a objetos en el desarrollo de software sostenible y escalable</w:t>
-      </w:r>
-      <w:r>
-        <w:t xml:space="preserve">. 2023. </w:t>
-      </w:r>
-      <w:hyperlink r:id="rId16" w:history="1">
-        <w:r>
-          <w:rPr>
-            <w:rFonts w:ascii="Calibri" w:eastAsia="Times New Roman" w:hAnsi="Calibri" w:cs="Calibri"/>
-            <w:color w:val="0563C1"/>
-            <w:u w:val="single"/>
-            <w:lang w:eastAsia="es-CO"/>
-          </w:rPr>
-          <w:t>https://ve.scielo.org/pdf/uct/v27n121/2542-3401-uct-27-121-85.pdf</w:t>
-        </w:r>
-      </w:hyperlink>
-      <w:r>
-        <w:t>.</w:t>
-      </w:r>
-    </w:p>
-    <w:p>
-      <w:pPr>
-        <w:rPr>
-          <w:rFonts w:ascii="Calibri" w:eastAsia="Times New Roman" w:hAnsi="Calibri" w:cs="Calibri"/>
-          <w:color w:val="000000"/>
-          <w:lang w:eastAsia="es-CO"/>
-        </w:rPr>
-      </w:pPr>
-      <w:hyperlink r:id="rId17" w:history="1">
-        <w:r>
-          <w:rPr>
-            <w:rFonts w:ascii="Calibri" w:eastAsia="Times New Roman" w:hAnsi="Calibri" w:cs="Calibri"/>
-            <w:color w:val="0563C1"/>
-            <w:u w:val="single"/>
-            <w:lang w:eastAsia="es-CO"/>
-          </w:rPr>
-          <w:t>https://sedici.unlp.edu.ar/bitstream/handle/10915/144325/Documento_completo.pdf-PDFA.pdf?sequence=1</w:t>
-        </w:r>
-      </w:hyperlink>
-      <w:r>
-        <w:t>[R13] Aspectos de ingeniería de software, bases de datos relacionales, no</w:t>
-      </w:r>
-      <w:r>
-        <w:br/>
-        <w:t>relacionales y como servicios en la nube para el desarrollo de</w:t>
-      </w:r>
-      <w:r>
-        <w:br/>
-        <w:t>sistemas de software híbridos 2022. .</w:t>
-      </w:r>
-    </w:p>
-    <w:p>
-      <w:pPr>
-        <w:rPr>
-          <w:rFonts w:ascii="Calibri" w:eastAsia="Times New Roman" w:hAnsi="Calibri" w:cs="Calibri"/>
-          <w:color w:val="000000"/>
-          <w:lang w:eastAsia="es-CO"/>
-        </w:rPr>
-      </w:pPr>
-      <w:r>
-        <w:t xml:space="preserve">[R14] </w:t>
-      </w:r>
-      <w:r>
-        <w:rPr>
-          <w:rFonts w:ascii="Calibri" w:eastAsia="Times New Roman" w:hAnsi="Calibri" w:cs="Calibri"/>
-          <w:color w:val="000000"/>
-          <w:lang w:eastAsia="es-CO"/>
-        </w:rPr>
-        <w:t xml:space="preserve">Machine </w:t>
-      </w:r>
-      <w:proofErr w:type="spellStart"/>
-      <w:r>
-        <w:rPr>
-          <w:rFonts w:ascii="Calibri" w:eastAsia="Times New Roman" w:hAnsi="Calibri" w:cs="Calibri"/>
-          <w:color w:val="000000"/>
-          <w:lang w:eastAsia="es-CO"/>
-        </w:rPr>
-        <w:t>learning</w:t>
-      </w:r>
-      <w:proofErr w:type="spellEnd"/>
-      <w:r>
-        <w:rPr>
-          <w:rFonts w:ascii="Calibri" w:eastAsia="Times New Roman" w:hAnsi="Calibri" w:cs="Calibri"/>
-          <w:color w:val="000000"/>
-          <w:lang w:eastAsia="es-CO"/>
-        </w:rPr>
-        <w:t xml:space="preserve"> aplicado al análisis del</w:t>
-      </w:r>
-      <w:r>
-        <w:rPr>
-          <w:rFonts w:ascii="Calibri" w:eastAsia="Times New Roman" w:hAnsi="Calibri" w:cs="Calibri"/>
-          <w:color w:val="000000"/>
-          <w:lang w:eastAsia="es-CO"/>
-        </w:rPr>
-        <w:t xml:space="preserve"> </w:t>
-      </w:r>
-      <w:r>
-        <w:rPr>
-          <w:rFonts w:ascii="Calibri" w:eastAsia="Times New Roman" w:hAnsi="Calibri" w:cs="Calibri"/>
-          <w:color w:val="000000"/>
-          <w:lang w:eastAsia="es-CO"/>
-        </w:rPr>
-        <w:t>rendimiento de desarrollos de software</w:t>
-      </w:r>
-      <w:r>
-        <w:t xml:space="preserve"> 2022. </w:t>
-      </w:r>
-      <w:hyperlink r:id="rId18" w:history="1">
-        <w:r>
-          <w:rPr>
-            <w:rFonts w:ascii="Calibri" w:eastAsia="Times New Roman" w:hAnsi="Calibri" w:cs="Calibri"/>
-            <w:color w:val="0563C1"/>
-            <w:u w:val="single"/>
-            <w:lang w:eastAsia="es-CO"/>
-          </w:rPr>
-          <w:t>https://www.redalyc.org/journal/6078/607870799010/607870799010.pdf</w:t>
-        </w:r>
-      </w:hyperlink>
-      <w:r>
-        <w:t>.</w:t>
-      </w:r>
-    </w:p>
-    <w:p>
-      <w:pPr>
-        <w:rPr>
-          <w:rFonts w:ascii="Calibri" w:eastAsia="Times New Roman" w:hAnsi="Calibri" w:cs="Calibri"/>
-          <w:color w:val="000000"/>
-          <w:lang w:eastAsia="es-CO"/>
-        </w:rPr>
-      </w:pPr>
-      <w:r>
-        <w:t xml:space="preserve">[R15] </w:t>
-      </w:r>
-      <w:r>
-        <w:rPr>
-          <w:rFonts w:ascii="Calibri" w:eastAsia="Times New Roman" w:hAnsi="Calibri" w:cs="Calibri"/>
-          <w:color w:val="000000"/>
-          <w:lang w:eastAsia="es-CO"/>
-        </w:rPr>
-        <w:t>Prácticas empíricas en la gestión de proyectos de desarrollo de software a partir de análisis del principio de adaptabilidad</w:t>
-      </w:r>
-      <w:r>
-        <w:rPr>
-          <w:rFonts w:ascii="Calibri" w:eastAsia="Times New Roman" w:hAnsi="Calibri" w:cs="Calibri"/>
-          <w:color w:val="000000"/>
-          <w:lang w:eastAsia="es-CO"/>
-        </w:rPr>
-        <w:t xml:space="preserve"> </w:t>
-      </w:r>
-      <w:r>
-        <w:t>2024</w:t>
-      </w:r>
-      <w:r>
-        <w:t xml:space="preserve">. </w:t>
-      </w:r>
-      <w:hyperlink r:id="rId19" w:history="1">
-        <w:r>
-          <w:rPr>
-            <w:rFonts w:ascii="Calibri" w:eastAsia="Times New Roman" w:hAnsi="Calibri" w:cs="Calibri"/>
-            <w:color w:val="0563C1"/>
-            <w:u w:val="single"/>
-            <w:lang w:eastAsia="es-CO"/>
-          </w:rPr>
-          <w:t>https://dspace.ups.edu.ec/bitstream/123456789/28055/1/UPS-CT011453.pdf</w:t>
-        </w:r>
-      </w:hyperlink>
-      <w:r>
-        <w:t>.</w:t>
-      </w:r>
-    </w:p>
-    <w:p>
-      <w:pPr>
-        <w:rPr>
-          <w:rFonts w:ascii="Calibri" w:eastAsia="Times New Roman" w:hAnsi="Calibri" w:cs="Calibri"/>
-          <w:color w:val="0563C1"/>
-          <w:u w:val="single"/>
-          <w:lang w:eastAsia="es-CO"/>
-        </w:rPr>
-      </w:pPr>
-      <w:r>
-        <w:t xml:space="preserve">[R16] </w:t>
-      </w:r>
-      <w:r>
-        <w:rPr>
-          <w:rFonts w:ascii="Calibri" w:eastAsia="Times New Roman" w:hAnsi="Calibri" w:cs="Calibri"/>
-          <w:color w:val="000000"/>
-          <w:lang w:eastAsia="es-CO"/>
-        </w:rPr>
-        <w:t>Arquitectura de software para el</w:t>
-      </w:r>
-      <w:r>
-        <w:rPr>
-          <w:rFonts w:ascii="Calibri" w:eastAsia="Times New Roman" w:hAnsi="Calibri" w:cs="Calibri"/>
-          <w:color w:val="000000"/>
-          <w:lang w:eastAsia="es-CO"/>
-        </w:rPr>
-        <w:t xml:space="preserve"> </w:t>
-      </w:r>
-      <w:r>
-        <w:rPr>
-          <w:rFonts w:ascii="Calibri" w:eastAsia="Times New Roman" w:hAnsi="Calibri" w:cs="Calibri"/>
-          <w:color w:val="000000"/>
-          <w:lang w:eastAsia="es-CO"/>
-        </w:rPr>
-        <w:t>desarrollo de herramienta Tecnológica de</w:t>
-      </w:r>
-      <w:r>
-        <w:rPr>
-          <w:rFonts w:ascii="Calibri" w:eastAsia="Times New Roman" w:hAnsi="Calibri" w:cs="Calibri"/>
-          <w:color w:val="000000"/>
-          <w:lang w:eastAsia="es-CO"/>
-        </w:rPr>
-        <w:t xml:space="preserve"> </w:t>
-      </w:r>
-      <w:r>
-        <w:rPr>
-          <w:rFonts w:ascii="Calibri" w:eastAsia="Times New Roman" w:hAnsi="Calibri" w:cs="Calibri"/>
-          <w:color w:val="000000"/>
-          <w:lang w:eastAsia="es-CO"/>
-        </w:rPr>
-        <w:t>Costos,</w:t>
-      </w:r>
-      <w:r>
-        <w:rPr>
-          <w:rFonts w:ascii="Calibri" w:eastAsia="Times New Roman" w:hAnsi="Calibri" w:cs="Calibri"/>
-          <w:color w:val="000000"/>
-          <w:lang w:eastAsia="es-CO"/>
-        </w:rPr>
-        <w:t xml:space="preserve"> </w:t>
-      </w:r>
-      <w:r>
-        <w:rPr>
-          <w:rFonts w:ascii="Calibri" w:eastAsia="Times New Roman" w:hAnsi="Calibri" w:cs="Calibri"/>
-          <w:color w:val="000000"/>
-          <w:lang w:eastAsia="es-CO"/>
-        </w:rPr>
-        <w:t>Presupuestos y Programación</w:t>
-      </w:r>
-      <w:r>
-        <w:rPr>
-          <w:rFonts w:ascii="Calibri" w:eastAsia="Times New Roman" w:hAnsi="Calibri" w:cs="Calibri"/>
-          <w:color w:val="000000"/>
-          <w:lang w:eastAsia="es-CO"/>
-        </w:rPr>
-        <w:t xml:space="preserve"> </w:t>
-      </w:r>
-      <w:r>
-        <w:rPr>
-          <w:rFonts w:ascii="Calibri" w:eastAsia="Times New Roman" w:hAnsi="Calibri" w:cs="Calibri"/>
-          <w:color w:val="000000"/>
-          <w:lang w:eastAsia="es-CO"/>
-        </w:rPr>
-        <w:t>de obra</w:t>
-      </w:r>
-      <w:r>
-        <w:t xml:space="preserve"> 2022. </w:t>
-      </w:r>
-      <w:hyperlink r:id="rId20" w:history="1">
-        <w:r>
-          <w:rPr>
-            <w:rFonts w:ascii="Calibri" w:eastAsia="Times New Roman" w:hAnsi="Calibri" w:cs="Calibri"/>
-            <w:color w:val="0563C1"/>
-            <w:u w:val="single"/>
-            <w:lang w:eastAsia="es-CO"/>
-          </w:rPr>
-          <w:t>https://www.redalyc.org/journal/5337/533774788007/533774788007.pdf</w:t>
-        </w:r>
-      </w:hyperlink>
-    </w:p>
-    <w:p>
-      <w:pPr>
-        <w:rPr>
-          <w:rFonts w:ascii="Calibri" w:eastAsia="Times New Roman" w:hAnsi="Calibri" w:cs="Calibri"/>
-          <w:color w:val="0563C1"/>
-          <w:u w:val="single"/>
-          <w:lang w:eastAsia="es-CO"/>
-        </w:rPr>
-      </w:pPr>
-      <w:r>
-        <w:t xml:space="preserve">[R17] </w:t>
-      </w:r>
-      <w:r>
-        <w:rPr>
-          <w:rFonts w:ascii="Calibri" w:eastAsia="Times New Roman" w:hAnsi="Calibri" w:cs="Calibri"/>
-          <w:color w:val="000000"/>
-          <w:lang w:eastAsia="es-CO"/>
-        </w:rPr>
-        <w:t xml:space="preserve">Desarrollo híbrido con </w:t>
-      </w:r>
-      <w:proofErr w:type="spellStart"/>
-      <w:r>
-        <w:rPr>
-          <w:rFonts w:ascii="Calibri" w:eastAsia="Times New Roman" w:hAnsi="Calibri" w:cs="Calibri"/>
-          <w:color w:val="000000"/>
-          <w:lang w:eastAsia="es-CO"/>
-        </w:rPr>
-        <w:t>flutter</w:t>
-      </w:r>
-      <w:proofErr w:type="spellEnd"/>
-      <w:r>
-        <w:t xml:space="preserve"> </w:t>
-      </w:r>
-      <w:r>
-        <w:t>202</w:t>
-      </w:r>
-      <w:r>
-        <w:t>2</w:t>
-      </w:r>
-      <w:r>
-        <w:t xml:space="preserve">. </w:t>
-      </w:r>
-      <w:hyperlink r:id="rId21" w:history="1">
-        <w:r>
-          <w:rPr>
-            <w:rFonts w:ascii="Calibri" w:eastAsia="Times New Roman" w:hAnsi="Calibri" w:cs="Calibri"/>
-            <w:color w:val="0563C1"/>
-            <w:u w:val="single"/>
-            <w:lang w:eastAsia="es-CO"/>
-          </w:rPr>
-          <w:t>https://ciencialatina.org/index.php/cienciala/article/view/2959/4350</w:t>
-        </w:r>
-      </w:hyperlink>
-    </w:p>
-    <w:p>
-      <w:pPr>
-        <w:rPr>
-          <w:rFonts w:ascii="Calibri" w:eastAsia="Times New Roman" w:hAnsi="Calibri" w:cs="Calibri"/>
-          <w:color w:val="0563C1"/>
-          <w:u w:val="single"/>
-          <w:lang w:eastAsia="es-CO"/>
-        </w:rPr>
-      </w:pPr>
-      <w:r>
-        <w:t xml:space="preserve">[R18] </w:t>
-      </w:r>
-      <w:r>
-        <w:rPr>
-          <w:rFonts w:ascii="Calibri" w:eastAsia="Times New Roman" w:hAnsi="Calibri" w:cs="Calibri"/>
-          <w:color w:val="000000"/>
-          <w:lang w:eastAsia="es-CO"/>
-        </w:rPr>
-        <w:t xml:space="preserve">Análisis comparativo de entornos de desarrollo móvil </w:t>
-      </w:r>
-      <w:r>
-        <w:t>2022</w:t>
-      </w:r>
-      <w:r>
-        <w:t xml:space="preserve">. </w:t>
-      </w:r>
-      <w:hyperlink r:id="rId22" w:history="1">
-        <w:r>
-          <w:rPr>
-            <w:rFonts w:ascii="Calibri" w:eastAsia="Times New Roman" w:hAnsi="Calibri" w:cs="Calibri"/>
-            <w:color w:val="0563C1"/>
-            <w:u w:val="single"/>
-            <w:lang w:eastAsia="es-CO"/>
-          </w:rPr>
-          <w:t>https://ciencialatina.org/index.php/cienciala/article/view/2950</w:t>
-        </w:r>
-      </w:hyperlink>
-    </w:p>
-    <w:p>
-      <w:pPr>
-        <w:rPr>
-          <w:rFonts w:ascii="Calibri" w:eastAsia="Times New Roman" w:hAnsi="Calibri" w:cs="Calibri"/>
-          <w:color w:val="000000"/>
-          <w:lang w:eastAsia="es-CO"/>
-        </w:rPr>
-      </w:pPr>
-      <w:r>
-        <w:t xml:space="preserve">[R19] </w:t>
-      </w:r>
-      <w:r>
-        <w:rPr>
-          <w:rFonts w:ascii="Calibri" w:eastAsia="Times New Roman" w:hAnsi="Calibri" w:cs="Calibri"/>
-          <w:color w:val="000000"/>
-          <w:lang w:eastAsia="es-CO"/>
-        </w:rPr>
-        <w:t xml:space="preserve">Módulo de recomendación de patrones de diseño para </w:t>
-      </w:r>
-      <w:proofErr w:type="spellStart"/>
-      <w:r>
-        <w:rPr>
-          <w:rFonts w:ascii="Calibri" w:eastAsia="Times New Roman" w:hAnsi="Calibri" w:cs="Calibri"/>
-          <w:color w:val="000000"/>
-          <w:lang w:eastAsia="es-CO"/>
-        </w:rPr>
-        <w:t>EGPat</w:t>
-      </w:r>
-      <w:proofErr w:type="spellEnd"/>
-      <w:r>
-        <w:rPr>
-          <w:rFonts w:ascii="Calibri" w:eastAsia="Times New Roman" w:hAnsi="Calibri" w:cs="Calibri"/>
-          <w:color w:val="000000"/>
-          <w:lang w:eastAsia="es-CO"/>
-        </w:rPr>
-        <w:t xml:space="preserve"> </w:t>
-      </w:r>
-      <w:r>
-        <w:t xml:space="preserve"> 202</w:t>
-      </w:r>
-      <w:r>
-        <w:t>1</w:t>
-      </w:r>
-      <w:r>
-        <w:t xml:space="preserve">. </w:t>
-      </w:r>
-      <w:hyperlink r:id="rId23" w:history="1">
-        <w:r>
-          <w:rPr>
-            <w:rFonts w:ascii="Calibri" w:eastAsia="Times New Roman" w:hAnsi="Calibri" w:cs="Calibri"/>
-            <w:color w:val="0563C1"/>
-            <w:u w:val="single"/>
-            <w:lang w:eastAsia="es-CO"/>
-          </w:rPr>
-          <w:t>http://scielo.sld.cu/pdf/rcci/v15n2/2227-1899-rcci-15-02-118.pdf</w:t>
-        </w:r>
-      </w:hyperlink>
-    </w:p>
-    <w:p>
-      <w:r>
-        <w:t>[R20] Elementos Reusables para Experimentar con Metodologías Basadas en Estrategias y Patrones de Privacidad 2023.</w:t>
-      </w:r>
-    </w:p>
-    <w:p>
-      <w:pPr>
-        <w:rPr>
-          <w:rFonts w:ascii="Calibri" w:eastAsia="Times New Roman" w:hAnsi="Calibri" w:cs="Calibri"/>
-          <w:color w:val="0563C1"/>
-          <w:u w:val="single"/>
-          <w:lang w:eastAsia="es-CO"/>
-        </w:rPr>
-      </w:pPr>
-      <w:hyperlink r:id="rId24" w:history="1">
-        <w:r>
-          <w:rPr>
-            <w:rStyle w:val="Hipervnculo"/>
-            <w:rFonts w:ascii="Calibri" w:eastAsia="Times New Roman" w:hAnsi="Calibri" w:cs="Calibri"/>
-            <w:lang w:eastAsia="es-CO"/>
-          </w:rPr>
-          <w:t>http://scielo.senescyt.gob.ec/pdf/rpolit/v51n2/2477-8990-rpolit-51-02-00113.pdf</w:t>
-        </w:r>
-      </w:hyperlink>
-    </w:p>
-    <w:p>
-      <w:pPr>
-        <w:rPr>
-          <w:rFonts w:ascii="Calibri" w:eastAsia="Times New Roman" w:hAnsi="Calibri" w:cs="Calibri"/>
-          <w:color w:val="0563C1"/>
-          <w:u w:val="single"/>
-          <w:lang w:eastAsia="es-CO"/>
-        </w:rPr>
-      </w:pPr>
-      <w:r>
-        <w:rPr>
-          <w:rFonts w:ascii="Calibri" w:eastAsia="Times New Roman" w:hAnsi="Calibri" w:cs="Calibri"/>
-          <w:color w:val="0563C1"/>
-          <w:u w:val="single"/>
-          <w:lang w:eastAsia="es-CO"/>
-        </w:rPr>
-        <w:br w:type="page"/>
-      </w:r>
-    </w:p>
-    <w:p>
-      <w:pPr>
-        <w:rPr>
-          <w:rFonts w:ascii="Calibri" w:eastAsia="Times New Roman" w:hAnsi="Calibri" w:cs="Calibri"/>
-          <w:color w:val="0563C1"/>
-          <w:u w:val="single"/>
-          <w:lang w:eastAsia="es-CO"/>
-        </w:rPr>
-      </w:pPr>
-    </w:p>
-    <w:p>
-      <w:r>
-        <w:rPr>
-          <w:b/>
-          <w:sz w:val="32"/>
-        </w:rPr>
-        <w:t>Anexos</w:t>
+        <w:t>Aplicación móvil apoyada en georreferenciación para transporte público (STOPBUS). (2016). https://core.ac.uk/download/pdf/352368119.pdf</w:t>
       </w:r>
     </w:p>
     <w:p>
       <w:r>
-        <w:t xml:space="preserve">Anexo A. Tabla de referencias </w:t>
+        <w:t>SisMo: Sistema de seguridad para motocicletas. (2016). https://web.archive.org/web/20180415091800id_/http://revistas.usc.edu.co/index.php/Ingenium/article/viewFile/651/518</w:t>
       </w:r>
     </w:p>
     <w:p>
       <w:r>
-        <w:rPr>
-          <w:noProof/>
-        </w:rPr>
-        <w:drawing>
-          <wp:inline distT="0" distB="0" distL="0" distR="0" wp14:anchorId="71D16FC6" wp14:editId="0AB9E270">
-            <wp:extent cx="5486400" cy="5822216"/>
-            <wp:effectExtent l="0" t="0" r="0" b="0"/>
-            <wp:docPr id="1" name="Picture 1"/>
-            <wp:cNvGraphicFramePr>
-              <a:graphicFrameLocks xmlns:a="http://schemas.openxmlformats.org/drawingml/2006/main" noChangeAspect="1"/>
-            </wp:cNvGraphicFramePr>
-            <a:graphic xmlns:a="http://schemas.openxmlformats.org/drawingml/2006/main">
-              <a:graphicData uri="http://schemas.openxmlformats.org/drawingml/2006/picture">
-                <pic:pic xmlns:pic="http://schemas.openxmlformats.org/drawingml/2006/picture">
-                  <pic:nvPicPr>
-                    <pic:cNvPr id="0" name="1eed6a91-b3b3-4b9c-b191-02124ff6d6fc.png"/>
-                    <pic:cNvPicPr/>
-                  </pic:nvPicPr>
-                  <pic:blipFill>
-                    <a:blip r:embed="rId25"/>
-                    <a:stretch>
-                      <a:fillRect/>
-                    </a:stretch>
-                  </pic:blipFill>
-                  <pic:spPr>
-                    <a:xfrm>
-                      <a:off x="0" y="0"/>
-                      <a:ext cx="5486400" cy="5822216"/>
-                    </a:xfrm>
-                    <a:prstGeom prst="rect">
-                      <a:avLst/>
-                    </a:prstGeom>
-                  </pic:spPr>
-                </pic:pic>
-              </a:graphicData>
-            </a:graphic>
-          </wp:inline>
-        </w:drawing>
+        <w:t>EasyRest: Generador automático de API REST basado en Spring Framework y motor de plantillas Beetl. (2022). https://d1wqtxts1xzle7.cloudfront.net/111860414/18841-libre.pdf</w:t>
+      </w:r>
+    </w:p>
+    <w:p>
+      <w:r>
+        <w:t>El papel de la programación orientada a objetos en el desarrollo de software sostenible y escalable. (2023). https://ve.scielo.org/pdf/uct/v27n121/2542-3401-uct-27-121-85.pdf</w:t>
+      </w:r>
+    </w:p>
+    <w:p>
+      <w:r>
+        <w:t>Aspectos de ingeniería de software, bases de datos relacionales y no relacionales y como servicios en la nube para el desarrollo de sistemas de software híbridos. (2022). https://sedici.unlp.edu.ar/bitstream/handle/10915/144325/Documento_completo.pdf-PDFA.pdf?sequence=1</w:t>
+      </w:r>
+    </w:p>
+    <w:p>
+      <w:r>
+        <w:t>Desarrollo híbrido con Flutter. (2022). https://ciencialatina.org/index.php/cienciala/article/view/2959/4350</w:t>
+      </w:r>
+    </w:p>
+    <w:p>
+      <w:r>
+        <w:t>Torres‑Berru, Y., et al. (2020). Migración de un monolito a microservicios, caso Kbus. Dominio de las Ciencias, 6(2), 763–781. https://dialnet.unirioja.es/servlet/articulo?codigo=7425696</w:t>
+      </w:r>
+    </w:p>
+    <w:p>
+      <w:r>
+        <w:t>Anyango, E. G., &amp; Kasichainula, V. (2025). Vehicle Theft Real-Time Tracking System in Uganda. International Journal of Innovative Science and Research Technology, 10(6), 913–919.</w:t>
+      </w:r>
+    </w:p>
+    <w:p>
+      <w:r>
+        <w:t>Odesanya, J. F., &amp; Famosipe, O. G. (2025). Cloud-based mobile-app tracking for outbound logistics. Transportation Research Procedia, 89, 42–50. https://trid.trb.org/View/2571597</w:t>
       </w:r>
     </w:p>
     <w:sectPr>
       <w:pgSz w:w="12240" w:h="15840"/>
-      <w:pgMar w:top="1440" w:right="1800" w:bottom="1440" w:left="1800" w:header="720" w:footer="720" w:gutter="0"/>
+      <w:pgMar w:top="1440" w:right="1701" w:bottom="1440" w:left="1701" w:header="720" w:footer="720" w:gutter="0"/>
       <w:cols w:space="720"/>
       <w:docGrid w:linePitch="360"/>
     </w:sectPr>
@@ -1641,31 +663,31 @@
       </w:rPr>
     </w:lvl>
   </w:abstractNum>
-  <w:num w:numId="1" w16cid:durableId="541136210">
+  <w:num w:numId="1" w16cid:durableId="1667395118">
     <w:abstractNumId w:val="8"/>
   </w:num>
-  <w:num w:numId="2" w16cid:durableId="2121411063">
+  <w:num w:numId="2" w16cid:durableId="1220365378">
     <w:abstractNumId w:val="6"/>
   </w:num>
-  <w:num w:numId="3" w16cid:durableId="221603077">
+  <w:num w:numId="3" w16cid:durableId="1626693661">
     <w:abstractNumId w:val="5"/>
   </w:num>
-  <w:num w:numId="4" w16cid:durableId="97608128">
+  <w:num w:numId="4" w16cid:durableId="830103916">
     <w:abstractNumId w:val="4"/>
   </w:num>
-  <w:num w:numId="5" w16cid:durableId="1052658675">
+  <w:num w:numId="5" w16cid:durableId="1720395276">
     <w:abstractNumId w:val="7"/>
   </w:num>
-  <w:num w:numId="6" w16cid:durableId="162941714">
+  <w:num w:numId="6" w16cid:durableId="1310787248">
     <w:abstractNumId w:val="3"/>
   </w:num>
-  <w:num w:numId="7" w16cid:durableId="1928608385">
+  <w:num w:numId="7" w16cid:durableId="1113787010">
     <w:abstractNumId w:val="2"/>
   </w:num>
-  <w:num w:numId="8" w16cid:durableId="1618751008">
+  <w:num w:numId="8" w16cid:durableId="1917393603">
     <w:abstractNumId w:val="1"/>
   </w:num>
-  <w:num w:numId="9" w16cid:durableId="1820417236">
+  <w:num w:numId="9" w16cid:durableId="928195029">
     <w:abstractNumId w:val="0"/>
   </w:num>
 </w:numbering>
@@ -2061,8 +1083,12 @@
     <w:name w:val="Normal"/>
     <w:qFormat/>
     <w:rsid w:val="00FC693F"/>
+    <w:pPr>
+      <w:spacing w:after="120" w:line="360" w:lineRule="auto"/>
+    </w:pPr>
     <w:rPr>
-      <w:lang w:val="es-CO"/>
+      <w:rFonts w:ascii="Times New Roman" w:hAnsi="Times New Roman"/>
+      <w:sz w:val="24"/>
     </w:rPr>
   </w:style>
   <w:style w:type="paragraph" w:styleId="Ttulo1">
@@ -2455,7 +1481,6 @@
       <w:iCs/>
       <w:color w:val="4F81BD" w:themeColor="accent1"/>
       <w:spacing w:val="15"/>
-      <w:sz w:val="24"/>
       <w:szCs w:val="24"/>
     </w:rPr>
   </w:style>
@@ -2493,9 +1518,6 @@
     <w:uiPriority w:val="99"/>
     <w:unhideWhenUsed/>
     <w:rsid w:val="00AA1D8D"/>
-    <w:pPr>
-      <w:spacing w:after="120"/>
-    </w:pPr>
   </w:style>
   <w:style w:type="character" w:customStyle="1" w:styleId="TextoindependienteCar">
     <w:name w:val="Texto independiente Car"/>
@@ -2512,7 +1534,7 @@
     <w:unhideWhenUsed/>
     <w:rsid w:val="00AA1D8D"/>
     <w:pPr>
-      <w:spacing w:after="120" w:line="480" w:lineRule="auto"/>
+      <w:spacing w:line="480" w:lineRule="auto"/>
     </w:pPr>
   </w:style>
   <w:style w:type="character" w:customStyle="1" w:styleId="Textoindependiente2Car">
@@ -2529,9 +1551,6 @@
     <w:uiPriority w:val="99"/>
     <w:unhideWhenUsed/>
     <w:rsid w:val="00AA1D8D"/>
-    <w:pPr>
-      <w:spacing w:after="120"/>
-    </w:pPr>
     <w:rPr>
       <w:sz w:val="16"/>
       <w:szCs w:val="16"/>
@@ -2666,7 +1685,6 @@
     <w:unhideWhenUsed/>
     <w:rsid w:val="0029639D"/>
     <w:pPr>
-      <w:spacing w:after="120"/>
       <w:ind w:left="360"/>
       <w:contextualSpacing/>
     </w:pPr>
@@ -2678,7 +1696,6 @@
     <w:unhideWhenUsed/>
     <w:rsid w:val="0029639D"/>
     <w:pPr>
-      <w:spacing w:after="120"/>
       <w:ind w:left="720"/>
       <w:contextualSpacing/>
     </w:pPr>
@@ -2690,7 +1707,6 @@
     <w:unhideWhenUsed/>
     <w:rsid w:val="0029639D"/>
     <w:pPr>
-      <w:spacing w:after="120"/>
       <w:ind w:left="1080"/>
       <w:contextualSpacing/>
     </w:pPr>
@@ -13053,29 +12069,6 @@
         <w:shd w:val="clear" w:color="auto" w:fill="FBCAA2" w:themeFill="accent6" w:themeFillTint="7F"/>
       </w:tcPr>
     </w:tblStylePr>
-  </w:style>
-  <w:style w:type="character" w:styleId="Hipervnculo">
-    <w:name w:val="Hyperlink"/>
-    <w:basedOn w:val="Fuentedeprrafopredeter"/>
-    <w:uiPriority w:val="99"/>
-    <w:unhideWhenUsed/>
-    <w:rsid w:val="003E2A0F"/>
-    <w:rPr>
-      <w:color w:val="0563C1"/>
-      <w:u w:val="single"/>
-    </w:rPr>
-  </w:style>
-  <w:style w:type="character" w:styleId="Mencinsinresolver">
-    <w:name w:val="Unresolved Mention"/>
-    <w:basedOn w:val="Fuentedeprrafopredeter"/>
-    <w:uiPriority w:val="99"/>
-    <w:semiHidden/>
-    <w:unhideWhenUsed/>
-    <w:rsid w:val="00F32BF2"/>
-    <w:rPr>
-      <w:color w:val="605E5C"/>
-      <w:shd w:val="clear" w:color="auto" w:fill="E1DFDD"/>
-    </w:rPr>
   </w:style>
 </w:styles>
 </file>

</xml_diff>